<commit_message>
Update MRIxFields2026 homepage, tasks, and supporting content
</commit_message>
<xml_diff>
--- a/pages/mrixfields-2026/public/consortium_list.docx
+++ b/pages/mrixfields-2026/public/consortium_list.docx
@@ -4,74 +4,261 @@
   <w:body>
     <w:p>
       <w:pPr>
-        <w:pBdr>
-          <w:bottom w:val="single" w:sz="8" w:space="6" w:color="4F81BD"/>
-        </w:pBdr>
+        <w:pStyle w:val="aa"/>
+        <w:spacing w:after="120" w:line="276" w:lineRule="auto"/>
+        <w:jc w:val="center"/>
+      </w:pPr>
+      <w:r>
+        <w:t>MRIxFields Consortium List</w:t>
+      </w:r>
+    </w:p>
+    <w:p>
+      <w:pPr>
+        <w:spacing w:after="240"/>
         <w:jc w:val="center"/>
       </w:pPr>
       <w:r>
         <w:rPr>
-          <w:b/>
-          <w:sz w:val="32"/>
+          <w:i/>
+          <w:color w:val="5A5A5A"/>
+          <w:sz w:val="21"/>
         </w:rPr>
-        <w:t>Human Phenome Project Technological Consortium</w:t>
-      </w:r>
-    </w:p>
-    <w:p/>
-    <w:p>
-      <w:r>
-        <w:rPr>
-          <w:b/>
-          <w:color w:val="2F5496"/>
-          <w:sz w:val="24"/>
-        </w:rPr>
-        <w:t>Consortium Members</w:t>
+        <w:t>Contributors organized by institution</w:t>
       </w:r>
     </w:p>
     <w:p>
       <w:pPr>
-        <w:spacing w:after="160"/>
+        <w:pStyle w:val="1"/>
+        <w:spacing w:before="160" w:after="60"/>
       </w:pPr>
       <w:r>
-        <w:t>Ran An, Wenyan Chai, Chen Chen, Longlong Chen, Weixin Chen, Qinsheng Chen, Wenxue Ding, Jinwen Feng, Lei Feng, Shujing Fu, Qingxia Huang, Jiani Gu, Wanwan Hou, Liguo Jia, Nan Jiang, Wan Jiang, Xuan Lan, Anxin Li, Hao Li, Ting Li, Yao Li, Huiqin Lin, Quanzhong Liu, Ting Liu, Yangyang Liu, Lan Luo, Quanne Niu, Yujie Pan, Xiaoqing Qiao, Zhaoyu Qin, Bing Shen, Shengli Shen, Biru Shi, Liangyan Tang, Mengting Wan, Chengyan Wang, Jialin Wang, Qi Wang, Qiying Wang, Rui Wang, Wenjing Zhang, Yunzhi Wang, Lingge Wu, Xin Xia, Hui Xie, Ying Yu, Hui Yuan, Chao Zhang, Yining Zhao, Yuanting Zheng, Chen Zhu, Lingli Zhu.</w:t>
-      </w:r>
-    </w:p>
-    <w:p>
-      <w:r>
-        <w:rPr>
-          <w:b/>
-          <w:color w:val="2F5496"/>
-          <w:sz w:val="24"/>
-        </w:rPr>
-        <w:t>Affiliations</w:t>
+        <w:t>Human Phenome Institute, Fudan University, China</w:t>
       </w:r>
     </w:p>
     <w:p>
       <w:pPr>
-        <w:ind w:left="259" w:hanging="259"/>
-        <w:jc w:val="both"/>
+        <w:spacing w:after="40"/>
+        <w:ind w:left="360" w:hanging="259"/>
       </w:pPr>
       <w:r>
-        <w:t xml:space="preserve">State Key Laboratory of Genetic Engineering, Human Phenome Institute, School of Life Sciences, </w:t>
-      </w:r>
-      <w:proofErr w:type="spellStart"/>
-      <w:r>
-        <w:t>Zhangjiang</w:t>
-      </w:r>
-      <w:proofErr w:type="spellEnd"/>
-      <w:r>
-        <w:t xml:space="preserve"> Fudan International Innovation Center, Fudan University, Shanghai 200433, China</w:t>
+        <w:t>• Chengyan Wang (Co-Event Leader, wangcy@fudan.edu.cn)</w:t>
       </w:r>
     </w:p>
-    <w:p/>
     <w:p>
       <w:pPr>
-        <w:jc w:val="right"/>
+        <w:spacing w:after="40"/>
+        <w:ind w:left="360" w:hanging="259"/>
+      </w:pPr>
+      <w:r>
+        <w:t>• Tianxing He</w:t>
+      </w:r>
+    </w:p>
+    <w:p>
+      <w:pPr>
+        <w:pStyle w:val="1"/>
+        <w:spacing w:before="160" w:after="60"/>
+      </w:pPr>
+      <w:r>
+        <w:t>Institute of Science and Technology for Brain-inspired Intelligence, Fudan University, China</w:t>
+      </w:r>
+    </w:p>
+    <w:p>
+      <w:pPr>
+        <w:spacing w:after="40"/>
+        <w:ind w:left="360" w:hanging="259"/>
+      </w:pPr>
+      <w:r>
+        <w:t>• Hao Li (Co-Event Leader, h_li@fudan.edu.cn)</w:t>
+      </w:r>
+    </w:p>
+    <w:p>
+      <w:pPr>
+        <w:spacing w:after="40"/>
+        <w:ind w:left="360" w:hanging="259"/>
+      </w:pPr>
+      <w:r>
+        <w:t>• He Wang</w:t>
+      </w:r>
+    </w:p>
+    <w:p>
+      <w:pPr>
+        <w:spacing w:after="40"/>
+        <w:ind w:left="360" w:hanging="259"/>
+      </w:pPr>
+      <w:r>
+        <w:t>• Weirui Cai</w:t>
+      </w:r>
+    </w:p>
+    <w:p>
+      <w:pPr>
+        <w:pStyle w:val="1"/>
+        <w:spacing w:before="160" w:after="60"/>
+      </w:pPr>
+      <w:r>
+        <w:t>School of Biomedical Engineering, ShanghaiTech University, China</w:t>
+      </w:r>
+    </w:p>
+    <w:p>
+      <w:pPr>
+        <w:spacing w:after="40"/>
+        <w:ind w:left="360" w:hanging="259"/>
+      </w:pPr>
+      <w:r>
+        <w:t>• Dinggang Shen</w:t>
+      </w:r>
+    </w:p>
+    <w:p>
+      <w:pPr>
+        <w:pStyle w:val="1"/>
+        <w:spacing w:before="160" w:after="60"/>
+      </w:pPr>
+      <w:r>
+        <w:t>Department of Bioengineering and I-X, Imperial College London, UK</w:t>
+      </w:r>
+    </w:p>
+    <w:p>
+      <w:pPr>
+        <w:spacing w:after="40"/>
+        <w:ind w:left="360" w:hanging="259"/>
+      </w:pPr>
+      <w:r>
+        <w:t>• Jiahao Huang (Platform Manager, j.huang21@imperial.ac.uk)</w:t>
+      </w:r>
+    </w:p>
+    <w:p>
+      <w:pPr>
+        <w:spacing w:after="40"/>
+        <w:ind w:left="360" w:hanging="259"/>
+      </w:pPr>
+      <w:r>
+        <w:t>• Guang Yang</w:t>
+      </w:r>
+    </w:p>
+    <w:p>
+      <w:pPr>
+        <w:pStyle w:val="1"/>
+        <w:spacing w:before="160" w:after="60"/>
+      </w:pPr>
+      <w:r>
+        <w:t>Department of Psychiatry and Neuroscience, Charite - Universitatsmedizin Berlin, Germany</w:t>
+      </w:r>
+    </w:p>
+    <w:p>
+      <w:pPr>
+        <w:spacing w:after="40"/>
+        <w:ind w:left="360" w:hanging="259"/>
+      </w:pPr>
+      <w:r>
+        <w:t>• Yuxiang Dai (Data Preprocessing and Evaluation Manager, yuxiangdai0627@gmail.com)</w:t>
+      </w:r>
+    </w:p>
+    <w:p>
+      <w:pPr>
+        <w:pStyle w:val="1"/>
+        <w:spacing w:before="160" w:after="60"/>
+      </w:pPr>
+      <w:r>
+        <w:t>School of Biomedical Engineering, Shanghai Jiao Tong University, China</w:t>
+      </w:r>
+    </w:p>
+    <w:p>
+      <w:pPr>
+        <w:spacing w:after="40"/>
+        <w:ind w:left="360" w:hanging="259"/>
+      </w:pPr>
+      <w:r>
+        <w:t>• Zhiyong Zhang</w:t>
+      </w:r>
+    </w:p>
+    <w:p>
+      <w:pPr>
+        <w:spacing w:after="40"/>
+        <w:ind w:left="360" w:hanging="259"/>
+      </w:pPr>
+      <w:r>
+        <w:t>• Cheng Jin</w:t>
+      </w:r>
+    </w:p>
+    <w:p>
+      <w:pPr>
+        <w:spacing w:after="40"/>
+        <w:ind w:left="360" w:hanging="259"/>
+      </w:pPr>
+      <w:r>
+        <w:t>• Hao Qi</w:t>
+      </w:r>
+    </w:p>
+    <w:p>
+      <w:pPr>
+        <w:spacing w:after="40"/>
+        <w:ind w:left="360" w:hanging="259"/>
+      </w:pPr>
+      <w:r>
+        <w:t>• Yueqi Qiu</w:t>
+      </w:r>
+    </w:p>
+    <w:p>
+      <w:pPr>
+        <w:pStyle w:val="1"/>
+        <w:spacing w:before="160" w:after="60"/>
+      </w:pPr>
+      <w:r>
+        <w:t>Leiden University, Netherlands</w:t>
+      </w:r>
+    </w:p>
+    <w:p>
+      <w:pPr>
+        <w:spacing w:after="40"/>
+        <w:ind w:left="360" w:hanging="259"/>
+      </w:pPr>
+      <w:r>
+        <w:t>• Andrew Web</w:t>
+      </w:r>
+    </w:p>
+    <w:p>
+      <w:pPr>
+        <w:pStyle w:val="1"/>
+        <w:spacing w:before="160" w:after="60"/>
+      </w:pPr>
+      <w:r>
+        <w:t>Department of Radiology, Zhongshan Hospital, Fudan University, Shanghai, China</w:t>
+      </w:r>
+    </w:p>
+    <w:p>
+      <w:pPr>
+        <w:spacing w:after="40"/>
+        <w:ind w:left="360" w:hanging="259"/>
+      </w:pPr>
+      <w:r>
+        <w:t>• Zhang Shi</w:t>
+      </w:r>
+    </w:p>
+    <w:p>
+      <w:pPr>
+        <w:pStyle w:val="1"/>
+        <w:spacing w:before="160" w:after="60"/>
+      </w:pPr>
+      <w:r>
+        <w:t>University Medical Center Freiburg, Germany</w:t>
+      </w:r>
+    </w:p>
+    <w:p>
+      <w:pPr>
+        <w:spacing w:after="40"/>
+        <w:ind w:left="360" w:hanging="259"/>
+      </w:pPr>
+      <w:r>
+        <w:t>• Juergen Hennig</w:t>
+      </w:r>
+    </w:p>
+    <w:p>
+      <w:pPr>
+        <w:spacing w:before="200" w:after="0"/>
       </w:pPr>
     </w:p>
     <w:sectPr>
       <w:pgSz w:w="12240" w:h="15840"/>
-      <w:pgMar w:top="1152" w:right="1224" w:bottom="1152" w:left="1224" w:header="720" w:footer="720" w:gutter="0"/>
+      <w:pgMar w:top="1152" w:right="1296" w:bottom="1008" w:left="1296" w:header="720" w:footer="720" w:gutter="0"/>
       <w:cols w:space="720"/>
       <w:docGrid w:linePitch="360"/>
     </w:sectPr>
@@ -252,31 +439,31 @@
       </w:rPr>
     </w:lvl>
   </w:abstractNum>
-  <w:num w:numId="1" w16cid:durableId="1318145712">
+  <w:num w:numId="1" w16cid:durableId="1365861639">
     <w:abstractNumId w:val="8"/>
   </w:num>
-  <w:num w:numId="2" w16cid:durableId="1756125485">
+  <w:num w:numId="2" w16cid:durableId="1685861227">
     <w:abstractNumId w:val="6"/>
   </w:num>
-  <w:num w:numId="3" w16cid:durableId="2049986117">
+  <w:num w:numId="3" w16cid:durableId="411242263">
     <w:abstractNumId w:val="5"/>
   </w:num>
-  <w:num w:numId="4" w16cid:durableId="759329265">
+  <w:num w:numId="4" w16cid:durableId="858741152">
     <w:abstractNumId w:val="4"/>
   </w:num>
-  <w:num w:numId="5" w16cid:durableId="1711568989">
+  <w:num w:numId="5" w16cid:durableId="592394656">
     <w:abstractNumId w:val="7"/>
   </w:num>
-  <w:num w:numId="6" w16cid:durableId="1841192698">
+  <w:num w:numId="6" w16cid:durableId="287786664">
     <w:abstractNumId w:val="3"/>
   </w:num>
-  <w:num w:numId="7" w16cid:durableId="1076901893">
+  <w:num w:numId="7" w16cid:durableId="282268815">
     <w:abstractNumId w:val="2"/>
   </w:num>
-  <w:num w:numId="8" w16cid:durableId="1790128148">
+  <w:num w:numId="8" w16cid:durableId="1144348029">
     <w:abstractNumId w:val="1"/>
   </w:num>
-  <w:num w:numId="9" w16cid:durableId="230699517">
+  <w:num w:numId="9" w16cid:durableId="1061706872">
     <w:abstractNumId w:val="0"/>
   </w:num>
 </w:numbering>
@@ -694,8 +881,8 @@
       <w:rFonts w:asciiTheme="majorHAnsi" w:eastAsiaTheme="majorEastAsia" w:hAnsiTheme="majorHAnsi" w:cstheme="majorBidi"/>
       <w:b/>
       <w:bCs/>
-      <w:color w:val="365F91" w:themeColor="accent1" w:themeShade="BF"/>
-      <w:sz w:val="28"/>
+      <w:color w:val="1F4E79"/>
+      <w:sz w:val="26"/>
       <w:szCs w:val="28"/>
     </w:rPr>
   </w:style>
@@ -1025,10 +1212,11 @@
     </w:pPr>
     <w:rPr>
       <w:rFonts w:asciiTheme="majorHAnsi" w:eastAsiaTheme="majorEastAsia" w:hAnsiTheme="majorHAnsi" w:cstheme="majorBidi"/>
-      <w:color w:val="17365D" w:themeColor="text2" w:themeShade="BF"/>
+      <w:b/>
+      <w:color w:val="1F4E79"/>
       <w:spacing w:val="5"/>
       <w:kern w:val="28"/>
-      <w:sz w:val="52"/>
+      <w:sz w:val="36"/>
       <w:szCs w:val="52"/>
     </w:rPr>
   </w:style>

</xml_diff>

<commit_message>
Update MRIxFields2026 homepage, tasks, and supporting content (#12)
Co-authored-by: Tianxing <htx@TianxingdeMacBook-Air.local>
</commit_message>
<xml_diff>
--- a/pages/mrixfields-2026/public/consortium_list.docx
+++ b/pages/mrixfields-2026/public/consortium_list.docx
@@ -4,74 +4,261 @@
   <w:body>
     <w:p>
       <w:pPr>
-        <w:pBdr>
-          <w:bottom w:val="single" w:sz="8" w:space="6" w:color="4F81BD"/>
-        </w:pBdr>
+        <w:pStyle w:val="aa"/>
+        <w:spacing w:after="120" w:line="276" w:lineRule="auto"/>
+        <w:jc w:val="center"/>
+      </w:pPr>
+      <w:r>
+        <w:t>MRIxFields Consortium List</w:t>
+      </w:r>
+    </w:p>
+    <w:p>
+      <w:pPr>
+        <w:spacing w:after="240"/>
         <w:jc w:val="center"/>
       </w:pPr>
       <w:r>
         <w:rPr>
-          <w:b/>
-          <w:sz w:val="32"/>
+          <w:i/>
+          <w:color w:val="5A5A5A"/>
+          <w:sz w:val="21"/>
         </w:rPr>
-        <w:t>Human Phenome Project Technological Consortium</w:t>
-      </w:r>
-    </w:p>
-    <w:p/>
-    <w:p>
-      <w:r>
-        <w:rPr>
-          <w:b/>
-          <w:color w:val="2F5496"/>
-          <w:sz w:val="24"/>
-        </w:rPr>
-        <w:t>Consortium Members</w:t>
+        <w:t>Contributors organized by institution</w:t>
       </w:r>
     </w:p>
     <w:p>
       <w:pPr>
-        <w:spacing w:after="160"/>
+        <w:pStyle w:val="1"/>
+        <w:spacing w:before="160" w:after="60"/>
       </w:pPr>
       <w:r>
-        <w:t>Ran An, Wenyan Chai, Chen Chen, Longlong Chen, Weixin Chen, Qinsheng Chen, Wenxue Ding, Jinwen Feng, Lei Feng, Shujing Fu, Qingxia Huang, Jiani Gu, Wanwan Hou, Liguo Jia, Nan Jiang, Wan Jiang, Xuan Lan, Anxin Li, Hao Li, Ting Li, Yao Li, Huiqin Lin, Quanzhong Liu, Ting Liu, Yangyang Liu, Lan Luo, Quanne Niu, Yujie Pan, Xiaoqing Qiao, Zhaoyu Qin, Bing Shen, Shengli Shen, Biru Shi, Liangyan Tang, Mengting Wan, Chengyan Wang, Jialin Wang, Qi Wang, Qiying Wang, Rui Wang, Wenjing Zhang, Yunzhi Wang, Lingge Wu, Xin Xia, Hui Xie, Ying Yu, Hui Yuan, Chao Zhang, Yining Zhao, Yuanting Zheng, Chen Zhu, Lingli Zhu.</w:t>
-      </w:r>
-    </w:p>
-    <w:p>
-      <w:r>
-        <w:rPr>
-          <w:b/>
-          <w:color w:val="2F5496"/>
-          <w:sz w:val="24"/>
-        </w:rPr>
-        <w:t>Affiliations</w:t>
+        <w:t>Human Phenome Institute, Fudan University, China</w:t>
       </w:r>
     </w:p>
     <w:p>
       <w:pPr>
-        <w:ind w:left="259" w:hanging="259"/>
-        <w:jc w:val="both"/>
+        <w:spacing w:after="40"/>
+        <w:ind w:left="360" w:hanging="259"/>
       </w:pPr>
       <w:r>
-        <w:t xml:space="preserve">State Key Laboratory of Genetic Engineering, Human Phenome Institute, School of Life Sciences, </w:t>
-      </w:r>
-      <w:proofErr w:type="spellStart"/>
-      <w:r>
-        <w:t>Zhangjiang</w:t>
-      </w:r>
-      <w:proofErr w:type="spellEnd"/>
-      <w:r>
-        <w:t xml:space="preserve"> Fudan International Innovation Center, Fudan University, Shanghai 200433, China</w:t>
+        <w:t>• Chengyan Wang (Co-Event Leader, wangcy@fudan.edu.cn)</w:t>
       </w:r>
     </w:p>
-    <w:p/>
     <w:p>
       <w:pPr>
-        <w:jc w:val="right"/>
+        <w:spacing w:after="40"/>
+        <w:ind w:left="360" w:hanging="259"/>
+      </w:pPr>
+      <w:r>
+        <w:t>• Tianxing He</w:t>
+      </w:r>
+    </w:p>
+    <w:p>
+      <w:pPr>
+        <w:pStyle w:val="1"/>
+        <w:spacing w:before="160" w:after="60"/>
+      </w:pPr>
+      <w:r>
+        <w:t>Institute of Science and Technology for Brain-inspired Intelligence, Fudan University, China</w:t>
+      </w:r>
+    </w:p>
+    <w:p>
+      <w:pPr>
+        <w:spacing w:after="40"/>
+        <w:ind w:left="360" w:hanging="259"/>
+      </w:pPr>
+      <w:r>
+        <w:t>• Hao Li (Co-Event Leader, h_li@fudan.edu.cn)</w:t>
+      </w:r>
+    </w:p>
+    <w:p>
+      <w:pPr>
+        <w:spacing w:after="40"/>
+        <w:ind w:left="360" w:hanging="259"/>
+      </w:pPr>
+      <w:r>
+        <w:t>• He Wang</w:t>
+      </w:r>
+    </w:p>
+    <w:p>
+      <w:pPr>
+        <w:spacing w:after="40"/>
+        <w:ind w:left="360" w:hanging="259"/>
+      </w:pPr>
+      <w:r>
+        <w:t>• Weirui Cai</w:t>
+      </w:r>
+    </w:p>
+    <w:p>
+      <w:pPr>
+        <w:pStyle w:val="1"/>
+        <w:spacing w:before="160" w:after="60"/>
+      </w:pPr>
+      <w:r>
+        <w:t>School of Biomedical Engineering, ShanghaiTech University, China</w:t>
+      </w:r>
+    </w:p>
+    <w:p>
+      <w:pPr>
+        <w:spacing w:after="40"/>
+        <w:ind w:left="360" w:hanging="259"/>
+      </w:pPr>
+      <w:r>
+        <w:t>• Dinggang Shen</w:t>
+      </w:r>
+    </w:p>
+    <w:p>
+      <w:pPr>
+        <w:pStyle w:val="1"/>
+        <w:spacing w:before="160" w:after="60"/>
+      </w:pPr>
+      <w:r>
+        <w:t>Department of Bioengineering and I-X, Imperial College London, UK</w:t>
+      </w:r>
+    </w:p>
+    <w:p>
+      <w:pPr>
+        <w:spacing w:after="40"/>
+        <w:ind w:left="360" w:hanging="259"/>
+      </w:pPr>
+      <w:r>
+        <w:t>• Jiahao Huang (Platform Manager, j.huang21@imperial.ac.uk)</w:t>
+      </w:r>
+    </w:p>
+    <w:p>
+      <w:pPr>
+        <w:spacing w:after="40"/>
+        <w:ind w:left="360" w:hanging="259"/>
+      </w:pPr>
+      <w:r>
+        <w:t>• Guang Yang</w:t>
+      </w:r>
+    </w:p>
+    <w:p>
+      <w:pPr>
+        <w:pStyle w:val="1"/>
+        <w:spacing w:before="160" w:after="60"/>
+      </w:pPr>
+      <w:r>
+        <w:t>Department of Psychiatry and Neuroscience, Charite - Universitatsmedizin Berlin, Germany</w:t>
+      </w:r>
+    </w:p>
+    <w:p>
+      <w:pPr>
+        <w:spacing w:after="40"/>
+        <w:ind w:left="360" w:hanging="259"/>
+      </w:pPr>
+      <w:r>
+        <w:t>• Yuxiang Dai (Data Preprocessing and Evaluation Manager, yuxiangdai0627@gmail.com)</w:t>
+      </w:r>
+    </w:p>
+    <w:p>
+      <w:pPr>
+        <w:pStyle w:val="1"/>
+        <w:spacing w:before="160" w:after="60"/>
+      </w:pPr>
+      <w:r>
+        <w:t>School of Biomedical Engineering, Shanghai Jiao Tong University, China</w:t>
+      </w:r>
+    </w:p>
+    <w:p>
+      <w:pPr>
+        <w:spacing w:after="40"/>
+        <w:ind w:left="360" w:hanging="259"/>
+      </w:pPr>
+      <w:r>
+        <w:t>• Zhiyong Zhang</w:t>
+      </w:r>
+    </w:p>
+    <w:p>
+      <w:pPr>
+        <w:spacing w:after="40"/>
+        <w:ind w:left="360" w:hanging="259"/>
+      </w:pPr>
+      <w:r>
+        <w:t>• Cheng Jin</w:t>
+      </w:r>
+    </w:p>
+    <w:p>
+      <w:pPr>
+        <w:spacing w:after="40"/>
+        <w:ind w:left="360" w:hanging="259"/>
+      </w:pPr>
+      <w:r>
+        <w:t>• Hao Qi</w:t>
+      </w:r>
+    </w:p>
+    <w:p>
+      <w:pPr>
+        <w:spacing w:after="40"/>
+        <w:ind w:left="360" w:hanging="259"/>
+      </w:pPr>
+      <w:r>
+        <w:t>• Yueqi Qiu</w:t>
+      </w:r>
+    </w:p>
+    <w:p>
+      <w:pPr>
+        <w:pStyle w:val="1"/>
+        <w:spacing w:before="160" w:after="60"/>
+      </w:pPr>
+      <w:r>
+        <w:t>Leiden University, Netherlands</w:t>
+      </w:r>
+    </w:p>
+    <w:p>
+      <w:pPr>
+        <w:spacing w:after="40"/>
+        <w:ind w:left="360" w:hanging="259"/>
+      </w:pPr>
+      <w:r>
+        <w:t>• Andrew Web</w:t>
+      </w:r>
+    </w:p>
+    <w:p>
+      <w:pPr>
+        <w:pStyle w:val="1"/>
+        <w:spacing w:before="160" w:after="60"/>
+      </w:pPr>
+      <w:r>
+        <w:t>Department of Radiology, Zhongshan Hospital, Fudan University, Shanghai, China</w:t>
+      </w:r>
+    </w:p>
+    <w:p>
+      <w:pPr>
+        <w:spacing w:after="40"/>
+        <w:ind w:left="360" w:hanging="259"/>
+      </w:pPr>
+      <w:r>
+        <w:t>• Zhang Shi</w:t>
+      </w:r>
+    </w:p>
+    <w:p>
+      <w:pPr>
+        <w:pStyle w:val="1"/>
+        <w:spacing w:before="160" w:after="60"/>
+      </w:pPr>
+      <w:r>
+        <w:t>University Medical Center Freiburg, Germany</w:t>
+      </w:r>
+    </w:p>
+    <w:p>
+      <w:pPr>
+        <w:spacing w:after="40"/>
+        <w:ind w:left="360" w:hanging="259"/>
+      </w:pPr>
+      <w:r>
+        <w:t>• Juergen Hennig</w:t>
+      </w:r>
+    </w:p>
+    <w:p>
+      <w:pPr>
+        <w:spacing w:before="200" w:after="0"/>
       </w:pPr>
     </w:p>
     <w:sectPr>
       <w:pgSz w:w="12240" w:h="15840"/>
-      <w:pgMar w:top="1152" w:right="1224" w:bottom="1152" w:left="1224" w:header="720" w:footer="720" w:gutter="0"/>
+      <w:pgMar w:top="1152" w:right="1296" w:bottom="1008" w:left="1296" w:header="720" w:footer="720" w:gutter="0"/>
       <w:cols w:space="720"/>
       <w:docGrid w:linePitch="360"/>
     </w:sectPr>
@@ -252,31 +439,31 @@
       </w:rPr>
     </w:lvl>
   </w:abstractNum>
-  <w:num w:numId="1" w16cid:durableId="1318145712">
+  <w:num w:numId="1" w16cid:durableId="1365861639">
     <w:abstractNumId w:val="8"/>
   </w:num>
-  <w:num w:numId="2" w16cid:durableId="1756125485">
+  <w:num w:numId="2" w16cid:durableId="1685861227">
     <w:abstractNumId w:val="6"/>
   </w:num>
-  <w:num w:numId="3" w16cid:durableId="2049986117">
+  <w:num w:numId="3" w16cid:durableId="411242263">
     <w:abstractNumId w:val="5"/>
   </w:num>
-  <w:num w:numId="4" w16cid:durableId="759329265">
+  <w:num w:numId="4" w16cid:durableId="858741152">
     <w:abstractNumId w:val="4"/>
   </w:num>
-  <w:num w:numId="5" w16cid:durableId="1711568989">
+  <w:num w:numId="5" w16cid:durableId="592394656">
     <w:abstractNumId w:val="7"/>
   </w:num>
-  <w:num w:numId="6" w16cid:durableId="1841192698">
+  <w:num w:numId="6" w16cid:durableId="287786664">
     <w:abstractNumId w:val="3"/>
   </w:num>
-  <w:num w:numId="7" w16cid:durableId="1076901893">
+  <w:num w:numId="7" w16cid:durableId="282268815">
     <w:abstractNumId w:val="2"/>
   </w:num>
-  <w:num w:numId="8" w16cid:durableId="1790128148">
+  <w:num w:numId="8" w16cid:durableId="1144348029">
     <w:abstractNumId w:val="1"/>
   </w:num>
-  <w:num w:numId="9" w16cid:durableId="230699517">
+  <w:num w:numId="9" w16cid:durableId="1061706872">
     <w:abstractNumId w:val="0"/>
   </w:num>
 </w:numbering>
@@ -694,8 +881,8 @@
       <w:rFonts w:asciiTheme="majorHAnsi" w:eastAsiaTheme="majorEastAsia" w:hAnsiTheme="majorHAnsi" w:cstheme="majorBidi"/>
       <w:b/>
       <w:bCs/>
-      <w:color w:val="365F91" w:themeColor="accent1" w:themeShade="BF"/>
-      <w:sz w:val="28"/>
+      <w:color w:val="1F4E79"/>
+      <w:sz w:val="26"/>
       <w:szCs w:val="28"/>
     </w:rPr>
   </w:style>
@@ -1025,10 +1212,11 @@
     </w:pPr>
     <w:rPr>
       <w:rFonts w:asciiTheme="majorHAnsi" w:eastAsiaTheme="majorEastAsia" w:hAnsiTheme="majorHAnsi" w:cstheme="majorBidi"/>
-      <w:color w:val="17365D" w:themeColor="text2" w:themeShade="BF"/>
+      <w:b/>
+      <w:color w:val="1F4E79"/>
       <w:spacing w:val="5"/>
       <w:kern w:val="28"/>
-      <w:sz w:val="52"/>
+      <w:sz w:val="36"/>
       <w:szCs w:val="52"/>
     </w:rPr>
   </w:style>

</xml_diff>